<commit_message>
fix(transformacoes): avisar quando a escala chega no limite e atualizar relatório da atividade 07
</commit_message>
<xml_diff>
--- a/relatorios/A7_CG_Derick Willer.docx
+++ b/relatorios/A7_CG_Derick Willer.docx
@@ -506,7 +506,7 @@
               <a:graphicData uri="http://schemas.openxmlformats.org/drawingml/2006/picture">
                 <pic:pic>
                   <pic:nvPicPr>
-                    <pic:cNvPr id="0" name="a7.png"/>
+                    <pic:cNvPr id="0" name="a7-final.png"/>
                     <pic:cNvPicPr/>
                   </pic:nvPicPr>
                   <pic:blipFill>
@@ -537,57 +537,7 @@
         <w:rPr>
           <w:i/>
         </w:rPr>
-        <w:t>Figura 1 - Polígono de 4 faces transladado e depois rotacionado 30°, com o centro marcado em branco</w:t>
-      </w:r>
-    </w:p>
-    <w:p>
-      <w:pPr>
-        <w:jc w:val="center"/>
-      </w:pPr>
-      <w:r>
-        <w:drawing>
-          <wp:inline xmlns:a="http://schemas.openxmlformats.org/drawingml/2006/main" xmlns:pic="http://schemas.openxmlformats.org/drawingml/2006/picture">
-            <wp:extent cx="5943600" cy="3714750"/>
-            <wp:docPr id="2" name="Picture 2"/>
-            <wp:cNvGraphicFramePr>
-              <a:graphicFrameLocks noChangeAspect="1"/>
-            </wp:cNvGraphicFramePr>
-            <a:graphic>
-              <a:graphicData uri="http://schemas.openxmlformats.org/drawingml/2006/picture">
-                <pic:pic>
-                  <pic:nvPicPr>
-                    <pic:cNvPr id="0" name="a7-menu.png"/>
-                    <pic:cNvPicPr/>
-                  </pic:nvPicPr>
-                  <pic:blipFill>
-                    <a:blip r:embed="rId9"/>
-                    <a:stretch>
-                      <a:fillRect/>
-                    </a:stretch>
-                  </pic:blipFill>
-                  <pic:spPr>
-                    <a:xfrm>
-                      <a:off x="0" y="0"/>
-                      <a:ext cx="5943600" cy="3714750"/>
-                    </a:xfrm>
-                    <a:prstGeom prst="rect"/>
-                  </pic:spPr>
-                </pic:pic>
-              </a:graphicData>
-            </a:graphic>
-          </wp:inline>
-        </w:drawing>
-      </w:r>
-    </w:p>
-    <w:p>
-      <w:pPr>
-        <w:jc w:val="center"/>
-      </w:pPr>
-      <w:r>
-        <w:rPr>
-          <w:i/>
-        </w:rPr>
-        <w:t>Figura 2 - Menu Transformações com a Rotação ativa</w:t>
+        <w:t>Figura 1 - Reta Bresenham rotacionada 45°, reta DDA transladada, circunferência ampliada e os dois polígonos rotacionados, com a Rotação ativa no menu</w:t>
       </w:r>
     </w:p>
     <w:sectPr>

</xml_diff>